<commit_message>
uploaded updated templates - learn set aside without commments, and tweaks to sign step
</commit_message>
<xml_diff>
--- a/docassemble/AKA2JBranding/data/templates/learn_set_aside_content.docx
+++ b/docassemble/AKA2JBranding/data/templates/learn_set_aside_content.docx
@@ -7,7 +7,17 @@
         <w:pStyle w:val="Body"/>
       </w:pPr>
       <w:r>
-        <w:t>A Motion to Set Aside Judgment or Order asks the judge to:</w:t>
+        <w:t xml:space="preserve">A </w:t>
+      </w:r>
+      <w:r>
+        <w:rPr>
+          <w:b/>
+          <w:bCs/>
+        </w:rPr>
+        <w:t>Motion to Set Aside Judgment or Order</w:t>
+      </w:r>
+      <w:r>
+        <w:t xml:space="preserve"> asks the judge to:</w:t>
       </w:r>
     </w:p>
     <w:p>
@@ -98,17 +108,6 @@
       <w:r>
         <w:t>your case all over again.</w:t>
       </w:r>
-      <w:commentRangeStart w:id="0"/>
-      <w:commentRangeEnd w:id="0"/>
-      <w:r>
-        <w:rPr>
-          <w:rStyle w:val="CommentReference"/>
-          <w:rFonts w:ascii="Arial" w:eastAsia="Arial" w:hAnsi="Arial" w:cs="Arial"/>
-          <w:color w:val="auto"/>
-          <w:spacing w:val="0"/>
-        </w:rPr>
-        <w:commentReference w:id="0"/>
-      </w:r>
       <w:r>
         <w:br/>
       </w:r>
@@ -223,17 +222,15 @@
       <w:pPr>
         <w:pStyle w:val="Body"/>
       </w:pPr>
-      <w:commentRangeStart w:id="1"/>
-      <w:r>
-        <w:t>For problems 1, 2, and 3, you must file your Motion to Set Aside</w:t>
-      </w:r>
-      <w:commentRangeEnd w:id="1"/>
+      <w:r>
+        <w:t xml:space="preserve">For problems 1, 2, and 3, you must file your </w:t>
+      </w:r>
       <w:r>
         <w:rPr>
-          <w:rStyle w:val="CommentReference"/>
-          <w:rFonts w:ascii="Arial" w:eastAsia="Arial" w:hAnsi="Arial" w:cs="Arial"/>
+          <w:b/>
+          <w:bCs/>
         </w:rPr>
-        <w:commentReference w:id="1"/>
+        <w:t>Motion to Set Aside</w:t>
       </w:r>
     </w:p>
     <w:p>
@@ -631,75 +628,6 @@
     </w:sectPr>
   </w:body>
 </w:document>
-</file>
-
-<file path=word/comments.xml><?xml version="1.0" encoding="utf-8"?>
-<w:comments xmlns:wpc="http://schemas.microsoft.com/office/word/2010/wordprocessingCanvas" xmlns:cx="http://schemas.microsoft.com/office/drawing/2014/chartex" xmlns:cx1="http://schemas.microsoft.com/office/drawing/2015/9/8/chartex" xmlns:cx2="http://schemas.microsoft.com/office/drawing/2015/10/21/chartex" xmlns:cx3="http://schemas.microsoft.com/office/drawing/2016/5/9/chartex" xmlns:cx4="http://schemas.microsoft.com/office/drawing/2016/5/10/chartex" xmlns:cx5="http://schemas.microsoft.com/office/drawing/2016/5/11/chartex" xmlns:cx6="http://schemas.microsoft.com/office/drawing/2016/5/12/chartex" xmlns:cx7="http://schemas.microsoft.com/office/drawing/2016/5/13/chartex" xmlns:cx8="http://schemas.microsoft.com/office/drawing/2016/5/14/chartex" xmlns:mc="http://schemas.openxmlformats.org/markup-compatibility/2006" xmlns:aink="http://schemas.microsoft.com/office/drawing/2016/ink" xmlns:am3d="http://schemas.microsoft.com/office/drawing/2017/model3d" xmlns:o="urn:schemas-microsoft-com:office:office" xmlns:r="http://schemas.openxmlformats.org/officeDocument/2006/relationships" xmlns:m="http://schemas.openxmlformats.org/officeDocument/2006/math" xmlns:v="urn:schemas-microsoft-com:vml" xmlns:wp14="http://schemas.microsoft.com/office/word/2010/wordprocessingDrawing" xmlns:wp="http://schemas.openxmlformats.org/drawingml/2006/wordprocessingDrawing" xmlns:w10="urn:schemas-microsoft-com:office:word" xmlns:w="http://schemas.openxmlformats.org/wordprocessingml/2006/main" xmlns:w14="http://schemas.microsoft.com/office/word/2010/wordml" xmlns:w15="http://schemas.microsoft.com/office/word/2012/wordml" xmlns:w16cex="http://schemas.microsoft.com/office/word/2018/wordml/cex" xmlns:w16cid="http://schemas.microsoft.com/office/word/2016/wordml/cid" xmlns:w16="http://schemas.microsoft.com/office/word/2018/wordml" xmlns:w16sdtdh="http://schemas.microsoft.com/office/word/2020/wordml/sdtdatahash" xmlns:w16se="http://schemas.microsoft.com/office/word/2015/wordml/symex" xmlns:wpg="http://schemas.microsoft.com/office/word/2010/wordprocessingGroup" xmlns:wpi="http://schemas.microsoft.com/office/word/2010/wordprocessingInk" xmlns:wne="http://schemas.microsoft.com/office/word/2006/wordml" xmlns:wps="http://schemas.microsoft.com/office/word/2010/wordprocessingShape" mc:Ignorable="w14 w15 w16se w16cid w16 w16cex w16sdtdh wp14">
-  <w:comment w:id="0" w:author="Caroline Robinson" w:date="2026-08-14T10:44:00Z" w:initials="CR">
-    <w:p>
-      <w:pPr>
-        <w:pStyle w:val="CommentText"/>
-      </w:pPr>
-      <w:r>
-        <w:rPr>
-          <w:rStyle w:val="CommentReference"/>
-        </w:rPr>
-        <w:annotationRef/>
-      </w:r>
-      <w:r>
-        <w:t>Pick on or the other  here.</w:t>
-      </w:r>
-    </w:p>
-  </w:comment>
-  <w:comment w:id="1" w:author="Caroline Robinson" w:date="2026-08-14T11:26:00Z" w:initials="CR">
-    <w:p>
-      <w:pPr>
-        <w:pStyle w:val="CommentText"/>
-      </w:pPr>
-      <w:r>
-        <w:rPr>
-          <w:rStyle w:val="CommentReference"/>
-        </w:rPr>
-        <w:annotationRef/>
-      </w:r>
-      <w:r>
-        <w:t xml:space="preserve">Use formatting from </w:t>
-      </w:r>
-      <w:r>
-        <w:t>"G:\Family Law\Legal Navigator\A Interviews\Changing Custody Order\drafts\docx\Action Plans\</w:t>
-      </w:r>
-      <w:proofErr w:type="spellStart"/>
-      <w:r>
-        <w:t>changing_child_custody_action_plan</w:t>
-      </w:r>
-      <w:proofErr w:type="spellEnd"/>
-      <w:r>
-        <w:t xml:space="preserve"> 2025-03-31.docx"</w:t>
-      </w:r>
-    </w:p>
-  </w:comment>
-</w:comments>
-</file>
-
-<file path=word/commentsExtended.xml><?xml version="1.0" encoding="utf-8"?>
-<w15:commentsEx xmlns:wpc="http://schemas.microsoft.com/office/word/2010/wordprocessingCanvas" xmlns:cx="http://schemas.microsoft.com/office/drawing/2014/chartex" xmlns:cx1="http://schemas.microsoft.com/office/drawing/2015/9/8/chartex" xmlns:cx2="http://schemas.microsoft.com/office/drawing/2015/10/21/chartex" xmlns:cx3="http://schemas.microsoft.com/office/drawing/2016/5/9/chartex" xmlns:cx4="http://schemas.microsoft.com/office/drawing/2016/5/10/chartex" xmlns:cx5="http://schemas.microsoft.com/office/drawing/2016/5/11/chartex" xmlns:cx6="http://schemas.microsoft.com/office/drawing/2016/5/12/chartex" xmlns:cx7="http://schemas.microsoft.com/office/drawing/2016/5/13/chartex" xmlns:cx8="http://schemas.microsoft.com/office/drawing/2016/5/14/chartex" xmlns:mc="http://schemas.openxmlformats.org/markup-compatibility/2006" xmlns:aink="http://schemas.microsoft.com/office/drawing/2016/ink" xmlns:am3d="http://schemas.microsoft.com/office/drawing/2017/model3d" xmlns:o="urn:schemas-microsoft-com:office:office" xmlns:r="http://schemas.openxmlformats.org/officeDocument/2006/relationships" xmlns:m="http://schemas.openxmlformats.org/officeDocument/2006/math" xmlns:v="urn:schemas-microsoft-com:vml" xmlns:wp14="http://schemas.microsoft.com/office/word/2010/wordprocessingDrawing" xmlns:wp="http://schemas.openxmlformats.org/drawingml/2006/wordprocessingDrawing" xmlns:w10="urn:schemas-microsoft-com:office:word" xmlns:w="http://schemas.openxmlformats.org/wordprocessingml/2006/main" xmlns:w14="http://schemas.microsoft.com/office/word/2010/wordml" xmlns:w15="http://schemas.microsoft.com/office/word/2012/wordml" xmlns:w16cex="http://schemas.microsoft.com/office/word/2018/wordml/cex" xmlns:w16cid="http://schemas.microsoft.com/office/word/2016/wordml/cid" xmlns:w16="http://schemas.microsoft.com/office/word/2018/wordml" xmlns:w16sdtdh="http://schemas.microsoft.com/office/word/2020/wordml/sdtdatahash" xmlns:w16se="http://schemas.microsoft.com/office/word/2015/wordml/symex" xmlns:wpg="http://schemas.microsoft.com/office/word/2010/wordprocessingGroup" xmlns:wpi="http://schemas.microsoft.com/office/word/2010/wordprocessingInk" xmlns:wne="http://schemas.microsoft.com/office/word/2006/wordml" xmlns:wps="http://schemas.microsoft.com/office/word/2010/wordprocessingShape" mc:Ignorable="w14 w15 w16se w16cid w16 w16cex w16sdtdh wp14">
-  <w15:commentEx w15:paraId="0BC9E50C" w15:done="0"/>
-  <w15:commentEx w15:paraId="7527677A" w15:done="0"/>
-</w15:commentsEx>
-</file>
-
-<file path=word/commentsExtensible.xml><?xml version="1.0" encoding="utf-8"?>
-<w16cex:commentsExtensible xmlns:wpc="http://schemas.microsoft.com/office/word/2010/wordprocessingCanvas" xmlns:cx="http://schemas.microsoft.com/office/drawing/2014/chartex" xmlns:cx1="http://schemas.microsoft.com/office/drawing/2015/9/8/chartex" xmlns:cx2="http://schemas.microsoft.com/office/drawing/2015/10/21/chartex" xmlns:cx3="http://schemas.microsoft.com/office/drawing/2016/5/9/chartex" xmlns:cx4="http://schemas.microsoft.com/office/drawing/2016/5/10/chartex" xmlns:cx5="http://schemas.microsoft.com/office/drawing/2016/5/11/chartex" xmlns:cx6="http://schemas.microsoft.com/office/drawing/2016/5/12/chartex" xmlns:cx7="http://schemas.microsoft.com/office/drawing/2016/5/13/chartex" xmlns:cx8="http://schemas.microsoft.com/office/drawing/2016/5/14/chartex" xmlns:mc="http://schemas.openxmlformats.org/markup-compatibility/2006" xmlns:aink="http://schemas.microsoft.com/office/drawing/2016/ink" xmlns:am3d="http://schemas.microsoft.com/office/drawing/2017/model3d" xmlns:o="urn:schemas-microsoft-com:office:office" xmlns:r="http://schemas.openxmlformats.org/officeDocument/2006/relationships" xmlns:m="http://schemas.openxmlformats.org/officeDocument/2006/math" xmlns:v="urn:schemas-microsoft-com:vml" xmlns:wp14="http://schemas.microsoft.com/office/word/2010/wordprocessingDrawing" xmlns:wp="http://schemas.openxmlformats.org/drawingml/2006/wordprocessingDrawing" xmlns:w10="urn:schemas-microsoft-com:office:word" xmlns:w="http://schemas.openxmlformats.org/wordprocessingml/2006/main" xmlns:w14="http://schemas.microsoft.com/office/word/2010/wordml" xmlns:w15="http://schemas.microsoft.com/office/word/2012/wordml" xmlns:w16cex="http://schemas.microsoft.com/office/word/2018/wordml/cex" xmlns:w16cid="http://schemas.microsoft.com/office/word/2016/wordml/cid" xmlns:w16="http://schemas.microsoft.com/office/word/2018/wordml" xmlns:w16sdtdh="http://schemas.microsoft.com/office/word/2020/wordml/sdtdatahash" xmlns:w16se="http://schemas.microsoft.com/office/word/2015/wordml/symex" xmlns:wpg="http://schemas.microsoft.com/office/word/2010/wordprocessingGroup" xmlns:wpi="http://schemas.microsoft.com/office/word/2010/wordprocessingInk" xmlns:wne="http://schemas.microsoft.com/office/word/2006/wordml" xmlns:wps="http://schemas.microsoft.com/office/word/2010/wordprocessingShape" mc:Ignorable="w14 w15 w16se w16cid w16 w16cex w16sdtdh wp14">
-  <w16cex:commentExtensible w16cex:durableId="2E297017" w16cex:dateUtc="2026-08-14T18:44:00Z"/>
-  <w16cex:commentExtensible w16cex:durableId="2E2979C9" w16cex:dateUtc="2026-08-14T19:26:00Z"/>
-</w16cex:commentsExtensible>
-</file>
-
-<file path=word/commentsIds.xml><?xml version="1.0" encoding="utf-8"?>
-<w16cid:commentsIds xmlns:wpc="http://schemas.microsoft.com/office/word/2010/wordprocessingCanvas" xmlns:cx="http://schemas.microsoft.com/office/drawing/2014/chartex" xmlns:cx1="http://schemas.microsoft.com/office/drawing/2015/9/8/chartex" xmlns:cx2="http://schemas.microsoft.com/office/drawing/2015/10/21/chartex" xmlns:cx3="http://schemas.microsoft.com/office/drawing/2016/5/9/chartex" xmlns:cx4="http://schemas.microsoft.com/office/drawing/2016/5/10/chartex" xmlns:cx5="http://schemas.microsoft.com/office/drawing/2016/5/11/chartex" xmlns:cx6="http://schemas.microsoft.com/office/drawing/2016/5/12/chartex" xmlns:cx7="http://schemas.microsoft.com/office/drawing/2016/5/13/chartex" xmlns:cx8="http://schemas.microsoft.com/office/drawing/2016/5/14/chartex" xmlns:mc="http://schemas.openxmlformats.org/markup-compatibility/2006" xmlns:aink="http://schemas.microsoft.com/office/drawing/2016/ink" xmlns:am3d="http://schemas.microsoft.com/office/drawing/2017/model3d" xmlns:o="urn:schemas-microsoft-com:office:office" xmlns:r="http://schemas.openxmlformats.org/officeDocument/2006/relationships" xmlns:m="http://schemas.openxmlformats.org/officeDocument/2006/math" xmlns:v="urn:schemas-microsoft-com:vml" xmlns:wp14="http://schemas.microsoft.com/office/word/2010/wordprocessingDrawing" xmlns:wp="http://schemas.openxmlformats.org/drawingml/2006/wordprocessingDrawing" xmlns:w10="urn:schemas-microsoft-com:office:word" xmlns:w="http://schemas.openxmlformats.org/wordprocessingml/2006/main" xmlns:w14="http://schemas.microsoft.com/office/word/2010/wordml" xmlns:w15="http://schemas.microsoft.com/office/word/2012/wordml" xmlns:w16cex="http://schemas.microsoft.com/office/word/2018/wordml/cex" xmlns:w16cid="http://schemas.microsoft.com/office/word/2016/wordml/cid" xmlns:w16="http://schemas.microsoft.com/office/word/2018/wordml" xmlns:w16sdtdh="http://schemas.microsoft.com/office/word/2020/wordml/sdtdatahash" xmlns:w16se="http://schemas.microsoft.com/office/word/2015/wordml/symex" xmlns:wpg="http://schemas.microsoft.com/office/word/2010/wordprocessingGroup" xmlns:wpi="http://schemas.microsoft.com/office/word/2010/wordprocessingInk" xmlns:wne="http://schemas.microsoft.com/office/word/2006/wordml" xmlns:wps="http://schemas.microsoft.com/office/word/2010/wordprocessingShape" mc:Ignorable="w14 w15 w16se w16cid w16 w16cex w16sdtdh wp14">
-  <w16cid:commentId w16cid:paraId="0BC9E50C" w16cid:durableId="2E297017"/>
-  <w16cid:commentId w16cid:paraId="7527677A" w16cid:durableId="2E2979C9"/>
-</w16cid:commentsIds>
 </file>
 
 <file path=word/numbering.xml><?xml version="1.0" encoding="utf-8"?>
@@ -2888,14 +2816,6 @@
     <w:abstractNumId w:val="9"/>
   </w:num>
 </w:numbering>
-</file>
-
-<file path=word/people.xml><?xml version="1.0" encoding="utf-8"?>
-<w15:people xmlns:wpc="http://schemas.microsoft.com/office/word/2010/wordprocessingCanvas" xmlns:cx="http://schemas.microsoft.com/office/drawing/2014/chartex" xmlns:cx1="http://schemas.microsoft.com/office/drawing/2015/9/8/chartex" xmlns:cx2="http://schemas.microsoft.com/office/drawing/2015/10/21/chartex" xmlns:cx3="http://schemas.microsoft.com/office/drawing/2016/5/9/chartex" xmlns:cx4="http://schemas.microsoft.com/office/drawing/2016/5/10/chartex" xmlns:cx5="http://schemas.microsoft.com/office/drawing/2016/5/11/chartex" xmlns:cx6="http://schemas.microsoft.com/office/drawing/2016/5/12/chartex" xmlns:cx7="http://schemas.microsoft.com/office/drawing/2016/5/13/chartex" xmlns:cx8="http://schemas.microsoft.com/office/drawing/2016/5/14/chartex" xmlns:mc="http://schemas.openxmlformats.org/markup-compatibility/2006" xmlns:aink="http://schemas.microsoft.com/office/drawing/2016/ink" xmlns:am3d="http://schemas.microsoft.com/office/drawing/2017/model3d" xmlns:o="urn:schemas-microsoft-com:office:office" xmlns:r="http://schemas.openxmlformats.org/officeDocument/2006/relationships" xmlns:m="http://schemas.openxmlformats.org/officeDocument/2006/math" xmlns:v="urn:schemas-microsoft-com:vml" xmlns:wp14="http://schemas.microsoft.com/office/word/2010/wordprocessingDrawing" xmlns:wp="http://schemas.openxmlformats.org/drawingml/2006/wordprocessingDrawing" xmlns:w10="urn:schemas-microsoft-com:office:word" xmlns:w="http://schemas.openxmlformats.org/wordprocessingml/2006/main" xmlns:w14="http://schemas.microsoft.com/office/word/2010/wordml" xmlns:w15="http://schemas.microsoft.com/office/word/2012/wordml" xmlns:w16cex="http://schemas.microsoft.com/office/word/2018/wordml/cex" xmlns:w16cid="http://schemas.microsoft.com/office/word/2016/wordml/cid" xmlns:w16="http://schemas.microsoft.com/office/word/2018/wordml" xmlns:w16sdtdh="http://schemas.microsoft.com/office/word/2020/wordml/sdtdatahash" xmlns:w16se="http://schemas.microsoft.com/office/word/2015/wordml/symex" xmlns:wpg="http://schemas.microsoft.com/office/word/2010/wordprocessingGroup" xmlns:wpi="http://schemas.microsoft.com/office/word/2010/wordprocessingInk" xmlns:wne="http://schemas.microsoft.com/office/word/2006/wordml" xmlns:wps="http://schemas.microsoft.com/office/word/2010/wordprocessingShape" mc:Ignorable="w14 w15 w16se w16cid w16 w16cex w16sdtdh wp14">
-  <w15:person w15:author="Caroline Robinson">
-    <w15:presenceInfo w15:providerId="AD" w15:userId="S::crobinson@akcourts.gov::90d5f6fb-be36-42a5-b1db-9f4aa0bce5fa"/>
-  </w15:person>
-</w15:people>
 </file>
 
 <file path=word/styles.xml><?xml version="1.0" encoding="utf-8"?>

</xml_diff>